<commit_message>
Update database version in project plan to MySQL8
</commit_message>
<xml_diff>
--- a/CMS_BLOG_APPLICATION_SRS.docx
+++ b/CMS_BLOG_APPLICATION_SRS.docx
@@ -96,7 +96,13 @@
         <w:rPr>
           <w:rFonts w:eastAsia="Book Antiqua"/>
         </w:rPr>
-        <w:t>Database: MySQL for development and H2 for tests</w:t>
+        <w:t>Database: MySQL</w:t>
+      </w:r>
+      <w:r>
+        <w:rPr>
+          <w:rFonts w:eastAsia="Book Antiqua"/>
+        </w:rPr>
+        <w:t>8</w:t>
       </w:r>
     </w:p>
     <w:p>

</xml_diff>